<commit_message>
Proposal: set lead unit = Shaanxi Univ of CM, joint unit = CACMS Info Inst, period = 12 months
</commit_message>
<xml_diff>
--- a/多模态中医药人工智能模型评测标准_陕西省地方标准立项申请书.docx
+++ b/多模态中医药人工智能模型评测标准_陕西省地方标准立项申请书.docx
@@ -115,7 +115,7 @@
           </w:tcPr>
           <w:p>
             <w:r>
-              <w:t>中国中医科学院中医药信息研究所；中国中医科学院临床基础研究所</w:t>
+              <w:t>中国中医科学院中医药信息研究所</w:t>
             </w:r>
           </w:p>
         </w:tc>
@@ -424,7 +424,7 @@
         <w:ind w:firstLine="480"/>
       </w:pPr>
       <w:r>
-        <w:t>联合起草单位：中国中医科学院中医药信息研究所、中国中医科学院临床基础研究所。</w:t>
+        <w:t>联合起草单位：中国中医科学院中医药信息研究所。</w:t>
       </w:r>
     </w:p>
     <w:p>

</xml_diff>